<commit_message>
Spring 2026 document update
</commit_message>
<xml_diff>
--- a/Lab06Report.docx
+++ b/Lab06Report.docx
@@ -147,7 +147,16 @@
           <w:sz w:val="24"/>
           <w:szCs w:val="24"/>
         </w:rPr>
-        <w:t xml:space="preserve"> 2024</w:t>
+        <w:t xml:space="preserve"> 202</w:t>
+      </w:r>
+      <w:r>
+        <w:rPr>
+          <w:rFonts w:ascii="Times New Roman" w:eastAsia="Times New Roman" w:hAnsi="Times New Roman"/>
+          <w:color w:val="000000"/>
+          <w:sz w:val="24"/>
+          <w:szCs w:val="24"/>
+        </w:rPr>
+        <w:t>5</w:t>
       </w:r>
     </w:p>
     <w:p>
@@ -1026,7 +1035,16 @@
           <w:sz w:val="24"/>
           <w:szCs w:val="24"/>
         </w:rPr>
-        <w:t>4 or 8</w:t>
+        <w:t xml:space="preserve">4 or </w:t>
+      </w:r>
+      <w:r>
+        <w:rPr>
+          <w:rFonts w:ascii="Times New Roman" w:hAnsi="Times New Roman"/>
+          <w:color w:val="000000"/>
+          <w:sz w:val="24"/>
+          <w:szCs w:val="24"/>
+        </w:rPr>
+        <w:t>5</w:t>
       </w:r>
       <w:r>
         <w:rPr>

</xml_diff>